<commit_message>
Update TCC Completo motivacao
</commit_message>
<xml_diff>
--- a/tcc-documentacao/Planejamento/TCC_Completo_rascunho.docx
+++ b/tcc-documentacao/Planejamento/TCC_Completo_rascunho.docx
@@ -249,6 +249,7 @@
           <w:color w:val="auto"/>
           <w:sz w:val="24"/>
           <w:szCs w:val="24"/>
+          <w:u w:val="single"/>
         </w:rPr>
       </w:pPr>
       <w:r>
@@ -292,43 +293,82 @@
         </w:rPr>
         <w:t>Motivação</w:t>
       </w:r>
+      <w:bookmarkStart w:id="2" w:name="_GoBack"/>
       <w:bookmarkEnd w:id="1"/>
-    </w:p>
-    <w:p>
-      <w:pPr>
-        <w:pStyle w:val="NormalWeb"/>
-        <w:jc w:val="both"/>
-        <w:rPr>
-          <w:rFonts w:ascii="Arial" w:hAnsi="Arial" w:cs="Arial"/>
-        </w:rPr>
-      </w:pPr>
-    </w:p>
-    <w:p>
-      <w:pPr>
-        <w:pStyle w:val="NormalWeb"/>
-        <w:jc w:val="both"/>
-        <w:rPr>
-          <w:rFonts w:ascii="Arial" w:hAnsi="Arial" w:cs="Arial"/>
-        </w:rPr>
-      </w:pPr>
-    </w:p>
-    <w:p>
-      <w:pPr>
-        <w:pStyle w:val="NormalWeb"/>
-        <w:jc w:val="both"/>
-        <w:rPr>
-          <w:rFonts w:ascii="Arial" w:hAnsi="Arial" w:cs="Arial"/>
-        </w:rPr>
-      </w:pPr>
-    </w:p>
-    <w:p>
-      <w:pPr>
-        <w:pStyle w:val="NormalWeb"/>
-        <w:jc w:val="both"/>
-        <w:rPr>
-          <w:rFonts w:ascii="Arial" w:hAnsi="Arial" w:cs="Arial"/>
-        </w:rPr>
-      </w:pPr>
+      <w:bookmarkEnd w:id="2"/>
+    </w:p>
+    <w:p>
+      <w:pPr>
+        <w:pStyle w:val="NormalWeb"/>
+        <w:jc w:val="both"/>
+        <w:rPr>
+          <w:rFonts w:ascii="Arial" w:hAnsi="Arial" w:cs="Arial"/>
+        </w:rPr>
+      </w:pPr>
+    </w:p>
+    <w:p>
+      <w:pPr>
+        <w:pStyle w:val="NormalWeb"/>
+        <w:ind w:firstLine="708"/>
+        <w:jc w:val="both"/>
+        <w:rPr>
+          <w:rFonts w:ascii="Arial" w:hAnsi="Arial" w:cs="Arial"/>
+        </w:rPr>
+      </w:pPr>
+      <w:r>
+        <w:rPr>
+          <w:rFonts w:ascii="Arial" w:hAnsi="Arial" w:cs="Arial"/>
+        </w:rPr>
+        <w:t>A motivação para o desenvolvimento deste trabalho está diretamente relacionada ao acúmulo de reclamações referentes à manutenção pública.  A motivação para o desenvolvimento deste trabalho está diretamente relacionada ao acúmulo de reclamações referentes à manutenção pública. Esse cenário mostra que existe uma grande barreira na comunicação entre os moradores e as prefeituras. Os canais tradicionais de atendimento costumam ser lentos, cheios de burocracia e não permitem que o cidadão acompanhe de perto o que está sendo feito para resolver o seu problema, prejudicando principalmente quem vive nos bairros mais afastados.</w:t>
+      </w:r>
+    </w:p>
+    <w:p>
+      <w:pPr>
+        <w:pStyle w:val="NormalWeb"/>
+        <w:ind w:firstLine="708"/>
+        <w:jc w:val="both"/>
+        <w:rPr>
+          <w:rFonts w:ascii="Arial" w:hAnsi="Arial" w:cs="Arial"/>
+        </w:rPr>
+      </w:pPr>
+      <w:r>
+        <w:rPr>
+          <w:rFonts w:ascii="Arial" w:hAnsi="Arial" w:cs="Arial"/>
+        </w:rPr>
+        <w:t xml:space="preserve">Diante do grande volume de queixas sem resposta sobre falta de iluminação, buracos nas ruas e pontos de ônibus quebrados, surgiu a oportunidade de usar a tecnologia para ajudar a mudar essa realidade. A intenção de transformar esse monte de reclamações soltas em informações organizadas e visíveis foi o que motivou a criação de um aplicativo. </w:t>
+      </w:r>
+    </w:p>
+    <w:p>
+      <w:pPr>
+        <w:pStyle w:val="NormalWeb"/>
+        <w:ind w:firstLine="708"/>
+        <w:jc w:val="both"/>
+        <w:rPr>
+          <w:rFonts w:ascii="Arial" w:hAnsi="Arial" w:cs="Arial"/>
+        </w:rPr>
+      </w:pPr>
+      <w:r>
+        <w:rPr>
+          <w:rFonts w:ascii="Arial" w:hAnsi="Arial" w:cs="Arial"/>
+        </w:rPr>
+        <w:t>A ideia é criar um espaço único onde as pessoas possam registrar os problemas e acompanhar o status de cada um de forma clara.        </w:t>
+      </w:r>
+    </w:p>
+    <w:p>
+      <w:pPr>
+        <w:pStyle w:val="NormalWeb"/>
+        <w:ind w:firstLine="708"/>
+        <w:jc w:val="both"/>
+        <w:rPr>
+          <w:rFonts w:ascii="Arial" w:hAnsi="Arial" w:cs="Arial"/>
+        </w:rPr>
+      </w:pPr>
+      <w:r>
+        <w:rPr>
+          <w:rFonts w:ascii="Arial" w:hAnsi="Arial" w:cs="Arial"/>
+        </w:rPr>
+        <w:t>Assim, o desenvolvimento deste projeto se justifica pela vontade de transformar a insatisfação da população em uma participação ativa na melhoria do próprio bairro. Com a criação desse sistema prático e fácil de usar, busca-se provar que as ferramentas digitais podem ser grandes aliadas do cidadão, ajudando a cobrar o poder público e agilizando a solução dos problemas do dia a dia nas cidades.</w:t>
+      </w:r>
     </w:p>
     <w:p>
       <w:pPr>
@@ -522,7 +562,7 @@
           <w:szCs w:val="24"/>
         </w:rPr>
       </w:pPr>
-      <w:bookmarkStart w:id="2" w:name="_Toc215588544"/>
+      <w:bookmarkStart w:id="3" w:name="_Toc215588544"/>
       <w:r>
         <w:rPr>
           <w:rFonts w:ascii="Arial" w:hAnsi="Arial" w:cs="Arial"/>
@@ -531,7 +571,6 @@
           <w:sz w:val="24"/>
           <w:szCs w:val="24"/>
         </w:rPr>
-        <w:lastRenderedPageBreak/>
         <w:t>1.</w:t>
       </w:r>
       <w:r>
@@ -564,7 +603,7 @@
         </w:rPr>
         <w:t>Desafios</w:t>
       </w:r>
-      <w:bookmarkEnd w:id="2"/>
+      <w:bookmarkEnd w:id="3"/>
     </w:p>
     <w:p>
       <w:pPr>
@@ -792,10 +831,9 @@
           <w:color w:val="auto"/>
           <w:sz w:val="24"/>
           <w:szCs w:val="24"/>
-          <w:u w:val="single"/>
-        </w:rPr>
-      </w:pPr>
-      <w:bookmarkStart w:id="3" w:name="_Toc215588545"/>
+        </w:rPr>
+      </w:pPr>
+      <w:bookmarkStart w:id="4" w:name="_Toc215588545"/>
       <w:r>
         <w:rPr>
           <w:rFonts w:ascii="Arial" w:hAnsi="Arial" w:cs="Arial"/>
@@ -803,24 +841,9 @@
           <w:color w:val="auto"/>
           <w:sz w:val="24"/>
           <w:szCs w:val="24"/>
-          <w:u w:val="single"/>
-        </w:rPr>
-        <w:lastRenderedPageBreak/>
-        <w:t xml:space="preserve">1.4 </w:t>
-      </w:r>
-      <w:r>
-        <w:rPr>
-          <w:rFonts w:ascii="Arial" w:hAnsi="Arial" w:cs="Arial"/>
-          <w:b/>
-          <w:color w:val="auto"/>
-          <w:sz w:val="24"/>
-          <w:szCs w:val="24"/>
-          <w:u w:val="single"/>
-        </w:rPr>
-        <w:t>Objetivos</w:t>
-      </w:r>
-      <w:bookmarkStart w:id="4" w:name="_GoBack"/>
-      <w:bookmarkEnd w:id="3"/>
+        </w:rPr>
+        <w:t>1.4 Objetivos</w:t>
+      </w:r>
       <w:bookmarkEnd w:id="4"/>
     </w:p>
     <w:p>
@@ -1003,6 +1026,7 @@
           <w:sz w:val="28"/>
           <w:szCs w:val="28"/>
         </w:rPr>
+        <w:lastRenderedPageBreak/>
         <w:t>Permitir a população acompanhar o estado da solicitação (a solicitação para os órgãos responsáveis, a resposta do órgão responsável, e todo o processo até a resolução do problema identificado pela população).</w:t>
       </w:r>
     </w:p>
@@ -1097,132 +1121,6 @@
         </w:rPr>
         <w:t>Permitir a população informar o estado do processo (as respostas que obteve dos órgãos competentes).</w:t>
       </w:r>
-    </w:p>
-    <w:p>
-      <w:pPr>
-        <w:pStyle w:val="NormalWeb"/>
-        <w:jc w:val="both"/>
-        <w:rPr>
-          <w:rFonts w:ascii="Arial" w:hAnsi="Arial" w:cs="Arial"/>
-        </w:rPr>
-      </w:pPr>
-    </w:p>
-    <w:p>
-      <w:pPr>
-        <w:pStyle w:val="NormalWeb"/>
-        <w:jc w:val="both"/>
-        <w:rPr>
-          <w:rFonts w:ascii="Arial" w:hAnsi="Arial" w:cs="Arial"/>
-        </w:rPr>
-      </w:pPr>
-    </w:p>
-    <w:p>
-      <w:pPr>
-        <w:pStyle w:val="NormalWeb"/>
-        <w:jc w:val="both"/>
-        <w:rPr>
-          <w:rFonts w:ascii="Arial" w:hAnsi="Arial" w:cs="Arial"/>
-        </w:rPr>
-      </w:pPr>
-    </w:p>
-    <w:p>
-      <w:pPr>
-        <w:pStyle w:val="NormalWeb"/>
-        <w:jc w:val="both"/>
-        <w:rPr>
-          <w:rFonts w:ascii="Arial" w:hAnsi="Arial" w:cs="Arial"/>
-        </w:rPr>
-      </w:pPr>
-    </w:p>
-    <w:p>
-      <w:pPr>
-        <w:pStyle w:val="NormalWeb"/>
-        <w:jc w:val="both"/>
-        <w:rPr>
-          <w:rFonts w:ascii="Arial" w:hAnsi="Arial" w:cs="Arial"/>
-        </w:rPr>
-      </w:pPr>
-    </w:p>
-    <w:p>
-      <w:pPr>
-        <w:pStyle w:val="NormalWeb"/>
-        <w:jc w:val="both"/>
-        <w:rPr>
-          <w:rFonts w:ascii="Arial" w:hAnsi="Arial" w:cs="Arial"/>
-        </w:rPr>
-      </w:pPr>
-    </w:p>
-    <w:p>
-      <w:pPr>
-        <w:pStyle w:val="NormalWeb"/>
-        <w:jc w:val="both"/>
-        <w:rPr>
-          <w:rFonts w:ascii="Arial" w:hAnsi="Arial" w:cs="Arial"/>
-        </w:rPr>
-      </w:pPr>
-    </w:p>
-    <w:p>
-      <w:pPr>
-        <w:pStyle w:val="NormalWeb"/>
-        <w:jc w:val="both"/>
-        <w:rPr>
-          <w:rFonts w:ascii="Arial" w:hAnsi="Arial" w:cs="Arial"/>
-        </w:rPr>
-      </w:pPr>
-    </w:p>
-    <w:p>
-      <w:pPr>
-        <w:pStyle w:val="NormalWeb"/>
-        <w:jc w:val="both"/>
-        <w:rPr>
-          <w:rFonts w:ascii="Arial" w:hAnsi="Arial" w:cs="Arial"/>
-        </w:rPr>
-      </w:pPr>
-    </w:p>
-    <w:p>
-      <w:pPr>
-        <w:pStyle w:val="NormalWeb"/>
-        <w:jc w:val="both"/>
-        <w:rPr>
-          <w:rFonts w:ascii="Arial" w:hAnsi="Arial" w:cs="Arial"/>
-        </w:rPr>
-      </w:pPr>
-    </w:p>
-    <w:p>
-      <w:pPr>
-        <w:pStyle w:val="NormalWeb"/>
-        <w:jc w:val="both"/>
-        <w:rPr>
-          <w:rFonts w:ascii="Arial" w:hAnsi="Arial" w:cs="Arial"/>
-        </w:rPr>
-      </w:pPr>
-    </w:p>
-    <w:p>
-      <w:pPr>
-        <w:pStyle w:val="NormalWeb"/>
-        <w:jc w:val="both"/>
-        <w:rPr>
-          <w:rFonts w:ascii="Arial" w:hAnsi="Arial" w:cs="Arial"/>
-        </w:rPr>
-      </w:pPr>
-    </w:p>
-    <w:p>
-      <w:pPr>
-        <w:pStyle w:val="NormalWeb"/>
-        <w:jc w:val="both"/>
-        <w:rPr>
-          <w:rFonts w:ascii="Arial" w:hAnsi="Arial" w:cs="Arial"/>
-        </w:rPr>
-      </w:pPr>
-    </w:p>
-    <w:p>
-      <w:pPr>
-        <w:pStyle w:val="NormalWeb"/>
-        <w:jc w:val="both"/>
-        <w:rPr>
-          <w:rFonts w:ascii="Arial" w:hAnsi="Arial" w:cs="Arial"/>
-        </w:rPr>
-      </w:pPr>
     </w:p>
     <w:p>
       <w:pPr>
@@ -1338,15 +1236,6 @@
     </w:p>
     <w:bookmarkEnd w:id="8"/>
     <w:p/>
-    <w:p>
-      <w:pPr>
-        <w:pStyle w:val="NormalWeb"/>
-        <w:jc w:val="both"/>
-        <w:rPr>
-          <w:rFonts w:ascii="Arial" w:hAnsi="Arial" w:cs="Arial"/>
-        </w:rPr>
-      </w:pPr>
-    </w:p>
     <w:p>
       <w:pPr>
         <w:pStyle w:val="NormalWeb"/>
@@ -2004,7 +1893,6 @@
           <w:rFonts w:cs="Arial"/>
           <w:szCs w:val="24"/>
         </w:rPr>
-        <w:lastRenderedPageBreak/>
         <w:t>HTML (</w:t>
       </w:r>
       <w:proofErr w:type="spellStart"/>
@@ -2063,6 +1951,7 @@
           <w:color w:val="000000" w:themeColor="text1"/>
           <w:szCs w:val="28"/>
         </w:rPr>
+        <w:lastRenderedPageBreak/>
         <w:t>4.1.2 CSS</w:t>
       </w:r>
       <w:bookmarkEnd w:id="16"/>
@@ -2567,7 +2456,6 @@
           <w:rFonts w:cs="Arial"/>
           <w:szCs w:val="24"/>
         </w:rPr>
-        <w:lastRenderedPageBreak/>
         <w:t xml:space="preserve">A linguagem de programação </w:t>
       </w:r>
       <w:proofErr w:type="spellStart"/>
@@ -2656,6 +2544,7 @@
           <w:color w:val="000000" w:themeColor="text1"/>
           <w:sz w:val="20"/>
         </w:rPr>
+        <w:lastRenderedPageBreak/>
         <w:t xml:space="preserve">Figura </w:t>
       </w:r>
       <w:r>
@@ -3123,7 +3012,6 @@
           <w:rFonts w:eastAsia="Arial" w:cs="Arial"/>
           <w:szCs w:val="24"/>
         </w:rPr>
-        <w:lastRenderedPageBreak/>
         <w:t>Java é uma linguagem de programação extremamente versátil que pode ser usado para programar softwares e aplicativos para muitos sistemas operacionais e dispositivos diferentes.</w:t>
       </w:r>
     </w:p>
@@ -3342,7 +3230,6 @@
           <w:color w:val="000000" w:themeColor="text1"/>
           <w:sz w:val="20"/>
         </w:rPr>
-        <w:lastRenderedPageBreak/>
         <w:t xml:space="preserve">Figura </w:t>
       </w:r>
       <w:r>
@@ -3591,6 +3478,7 @@
           <w:color w:val="000000" w:themeColor="text1"/>
           <w:sz w:val="20"/>
         </w:rPr>
+        <w:lastRenderedPageBreak/>
         <w:t xml:space="preserve">Figura </w:t>
       </w:r>
       <w:r>
@@ -3923,7 +3811,6 @@
           <w:color w:val="000000" w:themeColor="text1"/>
           <w:szCs w:val="28"/>
         </w:rPr>
-        <w:lastRenderedPageBreak/>
         <w:t xml:space="preserve">4.2.2 </w:t>
       </w:r>
       <w:proofErr w:type="spellStart"/>

</xml_diff>